<commit_message>
fix/review: 执行复审 round3（R19–R22 + R12–R18）全落地
R19 批次1自测判据改「整数分严格断言」（金额 === 无容差，比率 ±0.01）；
    diffCheck / 口径锁由打印升为断言；变异回验：+1 分注入使 #6/#9/#12 转红
    （旧 ±0.01 容差曾放行 #9），"经营参考改倒轧"破锁亦被拦；变异全程在临时副本，仓库零注入
R20 core/10 契约表对齐已实现 index.js:90-137，全表 snake_case + 金额 _fen；
    calcSandbox 同族 *Yuan 一并纠正；cleanItems 只收 amount_fen（明确拒 amountFen）
R21 verify_all SUITES 接入批次1自测 → 9/9 PASS；同步全树 4 处「8 套件」旧说法
R22 service.js fenToYuanStr 死三元清理（展示串仍经 ±1..2,000,000 分实测无浮点污染）
R12 三份 md/txt/docx/pdf 全部重生（补装 python-docx / pywin32；pdf 用 Word COM，一文件一实例）
R14 Runbook 步骤6 行号修正（prod 槽第17行 / dev 第16行）+ 消除「判据④唯一未完项」自相矛盾
R15 Runbook :52 appid 现状改为真值 wx33c110dc57a9c8dc
R16 重启键 :59 判据④第三处同步为「dev 侧已闭环」
R17 手册/工序清单 AppID 排错串、Runbook 三悬案措辞三处清尾
R18 check_error_codes.js DOC_PAIRS 加第三项「下一步工序清单」+ 汇总串去硬编码组名；
    附四步变异验证：注入即红且点名 → 还原即绿 → 残留 0

回归：门禁 A–L exit 0 ｜ verify_all 9/9 exit 0 ｜ batch1 selftest exit 0
</commit_message>
<xml_diff>
--- a/SMOKETEST_RUNBOOK.docx
+++ b/SMOKETEST_RUNBOOK.docx
@@ -31,7 +31,22 @@
           <w:rFonts w:ascii="Microsoft YaHei" w:hAnsi="Microsoft YaHei" w:eastAsia="Microsoft YaHei"/>
           <w:sz w:val="20"/>
         </w:rPr>
-        <w:t>用途：在真 wx-server-sdk / 真云数据库上一次性答完 4 个本地从没验证过的前提（A6 / A7 / require('./common') / doc().get() 契约）。 跑完这个再投喂批次 1，比「先投喂、后建环境」省一个来回。 配套代码已落盘：</w:t>
+        <w:t>⚠️ 本文档为</w:t>
+      </w:r>
+      <w:r>
+        <w:rPr>
+          <w:rFonts w:ascii="Microsoft YaHei" w:hAnsi="Microsoft YaHei" w:eastAsia="Microsoft YaHei"/>
+          <w:b/>
+          <w:sz w:val="20"/>
+        </w:rPr>
+        <w:t>派生件</w:t>
+      </w:r>
+      <w:r>
+        <w:rPr>
+          <w:rFonts w:ascii="Microsoft YaHei" w:hAnsi="Microsoft YaHei" w:eastAsia="Microsoft YaHei"/>
+          <w:sz w:val="20"/>
+        </w:rPr>
+        <w:t xml:space="preserve">：同名 </w:t>
       </w:r>
       <w:r>
         <w:rPr>
@@ -39,6 +54,1173 @@
           <w:color w:val="B03020"/>
           <w:sz w:val="19"/>
         </w:rPr>
+        <w:t>.txt</w:t>
+      </w:r>
+      <w:r>
+        <w:rPr>
+          <w:rFonts w:ascii="Microsoft YaHei" w:hAnsi="Microsoft YaHei" w:eastAsia="Microsoft YaHei"/>
+          <w:sz w:val="20"/>
+        </w:rPr>
+        <w:t xml:space="preserve"> / </w:t>
+      </w:r>
+      <w:r>
+        <w:rPr>
+          <w:rFonts w:ascii="Consolas" w:hAnsi="Consolas" w:eastAsia="Consolas"/>
+          <w:color w:val="B03020"/>
+          <w:sz w:val="19"/>
+        </w:rPr>
+        <w:t>.docx</w:t>
+      </w:r>
+      <w:r>
+        <w:rPr>
+          <w:rFonts w:ascii="Microsoft YaHei" w:hAnsi="Microsoft YaHei" w:eastAsia="Microsoft YaHei"/>
+          <w:sz w:val="20"/>
+        </w:rPr>
+        <w:t xml:space="preserve"> / </w:t>
+      </w:r>
+      <w:r>
+        <w:rPr>
+          <w:rFonts w:ascii="Consolas" w:hAnsi="Consolas" w:eastAsia="Consolas"/>
+          <w:color w:val="B03020"/>
+          <w:sz w:val="19"/>
+        </w:rPr>
+        <w:t>.pdf</w:t>
+      </w:r>
+      <w:r>
+        <w:rPr>
+          <w:rFonts w:ascii="Microsoft YaHei" w:hAnsi="Microsoft YaHei" w:eastAsia="Microsoft YaHei"/>
+          <w:sz w:val="20"/>
+        </w:rPr>
+        <w:t xml:space="preserve"> 均由本 </w:t>
+      </w:r>
+      <w:r>
+        <w:rPr>
+          <w:rFonts w:ascii="Consolas" w:hAnsi="Consolas" w:eastAsia="Consolas"/>
+          <w:color w:val="B03020"/>
+          <w:sz w:val="19"/>
+        </w:rPr>
+        <w:t>.md</w:t>
+      </w:r>
+      <w:r>
+        <w:rPr>
+          <w:rFonts w:ascii="Microsoft YaHei" w:hAnsi="Microsoft YaHei" w:eastAsia="Microsoft YaHei"/>
+          <w:sz w:val="20"/>
+        </w:rPr>
+        <w:t xml:space="preserve"> 生成，**冲突一律以 </w:t>
+      </w:r>
+      <w:r>
+        <w:rPr>
+          <w:rFonts w:ascii="Consolas" w:hAnsi="Consolas" w:eastAsia="Consolas"/>
+          <w:color w:val="B03020"/>
+          <w:sz w:val="19"/>
+        </w:rPr>
+        <w:t>.md</w:t>
+      </w:r>
+      <w:r>
+        <w:rPr>
+          <w:rFonts w:ascii="Microsoft YaHei" w:hAnsi="Microsoft YaHei" w:eastAsia="Microsoft YaHei"/>
+          <w:sz w:val="20"/>
+        </w:rPr>
+        <w:t xml:space="preserve"> 为准**（勿手改派生件）。</w:t>
+      </w:r>
+    </w:p>
+    <w:p>
+      <w:pPr>
+        <w:ind w:left="270"/>
+        <w:shd w:val="clear" w:color="auto" w:fill="F2F2F2"/>
+      </w:pPr>
+      <w:r/>
+      <w:r>
+        <w:rPr>
+          <w:rFonts w:ascii="Microsoft YaHei" w:hAnsi="Microsoft YaHei" w:eastAsia="Microsoft YaHei"/>
+          <w:sz w:val="20"/>
+        </w:rPr>
+        <w:t>用途：在真 wx-server-sdk / 真云数据库上一次性答完 4 个本地从没验证过的前提（A6 / A7 / require('./common') / doc().get() 契约）。 跑完这个再投喂批次 1，比「先投喂、后建环境」省一个来回。</w:t>
+      </w:r>
+    </w:p>
+    <w:p>
+      <w:pPr>
+        <w:ind w:left="270"/>
+        <w:shd w:val="clear" w:color="auto" w:fill="F2F2F2"/>
+      </w:pPr>
+      <w:r/>
+      <w:r>
+        <w:rPr>
+          <w:rFonts w:ascii="Microsoft YaHei" w:hAnsi="Microsoft YaHei" w:eastAsia="Microsoft YaHei"/>
+          <w:sz w:val="20"/>
+        </w:rPr>
+        <w:t xml:space="preserve">🔬 </w:t>
+      </w:r>
+      <w:r>
+        <w:rPr>
+          <w:rFonts w:ascii="Microsoft YaHei" w:hAnsi="Microsoft YaHei" w:eastAsia="Microsoft YaHei"/>
+          <w:b/>
+          <w:sz w:val="20"/>
+        </w:rPr>
+        <w:t>2026-09-14 晚实测已答一项（A7）</w:t>
+      </w:r>
+      <w:r>
+        <w:rPr>
+          <w:rFonts w:ascii="Microsoft YaHei" w:hAnsi="Microsoft YaHei" w:eastAsia="Microsoft YaHei"/>
+          <w:sz w:val="20"/>
+        </w:rPr>
+        <w:t xml:space="preserve">：在 dev 环境 </w:t>
+      </w:r>
+      <w:r>
+        <w:rPr>
+          <w:rFonts w:ascii="Consolas" w:hAnsi="Consolas" w:eastAsia="Consolas"/>
+          <w:color w:val="B03020"/>
+          <w:sz w:val="19"/>
+        </w:rPr>
+        <w:t>cloud1</w:t>
+      </w:r>
+      <w:r>
+        <w:rPr>
+          <w:rFonts w:ascii="Microsoft YaHei" w:hAnsi="Microsoft YaHei" w:eastAsia="Microsoft YaHei"/>
+          <w:sz w:val="20"/>
+        </w:rPr>
+        <w:t xml:space="preserve"> 上真跑 </w:t>
+      </w:r>
+      <w:r>
+        <w:rPr>
+          <w:rFonts w:ascii="Consolas" w:hAnsi="Consolas" w:eastAsia="Consolas"/>
+          <w:color w:val="B03020"/>
+          <w:sz w:val="19"/>
+        </w:rPr>
+        <w:t>initDb</w:t>
+      </w:r>
+      <w:r>
+        <w:rPr>
+          <w:rFonts w:ascii="Microsoft YaHei" w:hAnsi="Microsoft YaHei" w:eastAsia="Microsoft YaHei"/>
+          <w:sz w:val="20"/>
+        </w:rPr>
+        <w:t>，39 条索引</w:t>
+      </w:r>
+      <w:r>
+        <w:rPr>
+          <w:rFonts w:ascii="Microsoft YaHei" w:hAnsi="Microsoft YaHei" w:eastAsia="Microsoft YaHei"/>
+          <w:b/>
+          <w:sz w:val="20"/>
+        </w:rPr>
+        <w:t>全部</w:t>
+      </w:r>
+      <w:r>
+        <w:rPr>
+          <w:rFonts w:ascii="Microsoft YaHei" w:hAnsi="Microsoft YaHei" w:eastAsia="Microsoft YaHei"/>
+          <w:sz w:val="20"/>
+        </w:rPr>
+        <w:t xml:space="preserve">报 </w:t>
+      </w:r>
+      <w:r>
+        <w:rPr>
+          <w:rFonts w:ascii="Consolas" w:hAnsi="Consolas" w:eastAsia="Consolas"/>
+          <w:color w:val="B03020"/>
+          <w:sz w:val="19"/>
+        </w:rPr>
+        <w:t>db.collection(...).createIndex is not a function</w:t>
+      </w:r>
+      <w:r>
+        <w:rPr>
+          <w:rFonts w:ascii="Microsoft YaHei" w:hAnsi="Microsoft YaHei" w:eastAsia="Microsoft YaHei"/>
+          <w:sz w:val="20"/>
+        </w:rPr>
+        <w:t xml:space="preserve"> —— 即 wx-server-sdk </w:t>
+      </w:r>
+      <w:r>
+        <w:rPr>
+          <w:rFonts w:ascii="Microsoft YaHei" w:hAnsi="Microsoft YaHei" w:eastAsia="Microsoft YaHei"/>
+          <w:b/>
+          <w:sz w:val="20"/>
+        </w:rPr>
+        <w:t>压根不存在这个方法</w:t>
+      </w:r>
+      <w:r>
+        <w:rPr>
+          <w:rFonts w:ascii="Microsoft YaHei" w:hAnsi="Microsoft YaHei" w:eastAsia="Microsoft YaHei"/>
+          <w:sz w:val="20"/>
+        </w:rPr>
+        <w:t xml:space="preserve">（不是"调用失败"，是"没有这个接口"）。 ⇒ </w:t>
+      </w:r>
+      <w:r>
+        <w:rPr>
+          <w:rFonts w:ascii="Microsoft YaHei" w:hAnsi="Microsoft YaHei" w:eastAsia="Microsoft YaHei"/>
+          <w:b/>
+          <w:sz w:val="20"/>
+        </w:rPr>
+        <w:t>A7 = 不支持，且坐实为 SDK 层面缺失</w:t>
+      </w:r>
+      <w:r>
+        <w:rPr>
+          <w:rFonts w:ascii="Microsoft YaHei" w:hAnsi="Microsoft YaHei" w:eastAsia="Microsoft YaHei"/>
+          <w:sz w:val="20"/>
+        </w:rPr>
+        <w:t>（非偶发）→ 索引</w:t>
+      </w:r>
+      <w:r>
+        <w:rPr>
+          <w:rFonts w:ascii="Microsoft YaHei" w:hAnsi="Microsoft YaHei" w:eastAsia="Microsoft YaHei"/>
+          <w:b/>
+          <w:sz w:val="20"/>
+        </w:rPr>
+        <w:t>只能云端控制台手工建</w:t>
+      </w:r>
+      <w:r>
+        <w:rPr>
+          <w:rFonts w:ascii="Microsoft YaHei" w:hAnsi="Microsoft YaHei" w:eastAsia="Microsoft YaHei"/>
+          <w:sz w:val="20"/>
+        </w:rPr>
+        <w:t>；按本 Runbook §五的既定判读，</w:t>
+      </w:r>
+      <w:r>
+        <w:rPr>
+          <w:rFonts w:ascii="Microsoft YaHei" w:hAnsi="Microsoft YaHei" w:eastAsia="Microsoft YaHei"/>
+          <w:b/>
+          <w:sz w:val="20"/>
+        </w:rPr>
+        <w:t>A6 相应升级为「可能重复账号」</w:t>
+      </w:r>
+      <w:r>
+        <w:rPr>
+          <w:rFonts w:ascii="Microsoft YaHei" w:hAnsi="Microsoft YaHei" w:eastAsia="Microsoft YaHei"/>
+          <w:sz w:val="20"/>
+        </w:rPr>
+        <w:t xml:space="preserve">，首建档须加 unique 冲突重试（或改用其他去重手段）。 ✅ </w:t>
+      </w:r>
+      <w:r>
+        <w:rPr>
+          <w:rFonts w:ascii="Microsoft YaHei" w:hAnsi="Microsoft YaHei" w:eastAsia="Microsoft YaHei"/>
+          <w:b/>
+          <w:sz w:val="20"/>
+        </w:rPr>
+        <w:t>2026-09-15：四项前提全部答完（smokeTest 探针 v3 真云端实跑）</w:t>
+      </w:r>
+      <w:r>
+        <w:rPr>
+          <w:rFonts w:ascii="Microsoft YaHei" w:hAnsi="Microsoft YaHei" w:eastAsia="Microsoft YaHei"/>
+          <w:sz w:val="20"/>
+        </w:rPr>
+        <w:t>，见下表。</w:t>
+      </w:r>
+      <w:r>
+        <w:rPr>
+          <w:rFonts w:ascii="Microsoft YaHei" w:hAnsi="Microsoft YaHei" w:eastAsia="Microsoft YaHei"/>
+          <w:b/>
+          <w:sz w:val="20"/>
+        </w:rPr>
+        <w:t>批次 1 前置全部解除。</w:t>
+      </w:r>
+    </w:p>
+    <w:p>
+      <w:pPr>
+        <w:pStyle w:val="Heading2"/>
+      </w:pPr>
+      <w:r>
+        <w:rPr>
+          <w:b/>
+        </w:rPr>
+      </w:r>
+      <w:r>
+        <w:rPr>
+          <w:rFonts w:ascii="Microsoft YaHei" w:hAnsi="Microsoft YaHei" w:eastAsia="Microsoft YaHei"/>
+          <w:b/>
+          <w:sz w:val="23"/>
+        </w:rPr>
+        <w:t>🏁 四前提终局结论（2026-09-15 云端实测，真 wx-server-sdk）</w:t>
+      </w:r>
+    </w:p>
+    <w:tbl>
+      <w:tblPr>
+        <w:tblStyle w:val="TableGrid"/>
+        <w:tblW w:type="auto" w:w="0"/>
+        <w:jc w:val="center"/>
+        <w:tblLook w:firstColumn="1" w:firstRow="1" w:lastColumn="0" w:lastRow="0" w:noHBand="0" w:noVBand="1" w:val="04A0"/>
+      </w:tblPr>
+      <w:tblGrid>
+        <w:gridCol w:w="2466"/>
+        <w:gridCol w:w="2466"/>
+        <w:gridCol w:w="2466"/>
+        <w:gridCol w:w="2466"/>
+      </w:tblGrid>
+      <w:tr>
+        <w:trPr>
+          <w:tblHeader w:val="true"/>
+        </w:trPr>
+        <w:tc>
+          <w:tcPr>
+            <w:tcW w:type="dxa" w:w="2466"/>
+            <w:shd w:val="clear" w:color="auto" w:fill="4472C4"/>
+          </w:tcPr>
+          <w:p>
+            <w:r>
+              <w:rPr>
+                <w:b/>
+                <w:color w:val="FFFFFF"/>
+              </w:rPr>
+            </w:r>
+            <w:r>
+              <w:rPr>
+                <w:rFonts w:ascii="Microsoft YaHei" w:hAnsi="Microsoft YaHei" w:eastAsia="Microsoft YaHei"/>
+                <w:b/>
+                <w:color w:val="FFFFFF"/>
+                <w:sz w:val="19"/>
+              </w:rPr>
+              <w:t>前提</w:t>
+            </w:r>
+          </w:p>
+        </w:tc>
+        <w:tc>
+          <w:tcPr>
+            <w:tcW w:type="dxa" w:w="2466"/>
+            <w:shd w:val="clear" w:color="auto" w:fill="4472C4"/>
+          </w:tcPr>
+          <w:p>
+            <w:r>
+              <w:rPr>
+                <w:b/>
+                <w:color w:val="FFFFFF"/>
+              </w:rPr>
+            </w:r>
+            <w:r>
+              <w:rPr>
+                <w:rFonts w:ascii="Microsoft YaHei" w:hAnsi="Microsoft YaHei" w:eastAsia="Microsoft YaHei"/>
+                <w:b/>
+                <w:color w:val="FFFFFF"/>
+                <w:sz w:val="19"/>
+              </w:rPr>
+              <w:t>结论</w:t>
+            </w:r>
+          </w:p>
+        </w:tc>
+        <w:tc>
+          <w:tcPr>
+            <w:tcW w:type="dxa" w:w="2466"/>
+            <w:shd w:val="clear" w:color="auto" w:fill="4472C4"/>
+          </w:tcPr>
+          <w:p>
+            <w:r>
+              <w:rPr>
+                <w:b/>
+                <w:color w:val="FFFFFF"/>
+              </w:rPr>
+            </w:r>
+            <w:r>
+              <w:rPr>
+                <w:rFonts w:ascii="Microsoft YaHei" w:hAnsi="Microsoft YaHei" w:eastAsia="Microsoft YaHei"/>
+                <w:b/>
+                <w:color w:val="FFFFFF"/>
+                <w:sz w:val="19"/>
+              </w:rPr>
+              <w:t>云端实测证据</w:t>
+            </w:r>
+          </w:p>
+        </w:tc>
+        <w:tc>
+          <w:tcPr>
+            <w:tcW w:type="dxa" w:w="2466"/>
+            <w:shd w:val="clear" w:color="auto" w:fill="4472C4"/>
+          </w:tcPr>
+          <w:p>
+            <w:r>
+              <w:rPr>
+                <w:b/>
+                <w:color w:val="FFFFFF"/>
+              </w:rPr>
+            </w:r>
+            <w:r>
+              <w:rPr>
+                <w:rFonts w:ascii="Microsoft YaHei" w:hAnsi="Microsoft YaHei" w:eastAsia="Microsoft YaHei"/>
+                <w:b/>
+                <w:color w:val="FFFFFF"/>
+                <w:sz w:val="19"/>
+              </w:rPr>
+              <w:t>对后续代码的影响</w:t>
+            </w:r>
+          </w:p>
+        </w:tc>
+      </w:tr>
+      <w:tr>
+        <w:tc>
+          <w:tcPr>
+            <w:tcW w:type="dxa" w:w="2466"/>
+          </w:tcPr>
+          <w:p>
+            <w:r/>
+            <w:r>
+              <w:rPr>
+                <w:rFonts w:ascii="Microsoft YaHei" w:hAnsi="Microsoft YaHei" w:eastAsia="Microsoft YaHei"/>
+                <w:b/>
+                <w:sz w:val="19"/>
+              </w:rPr>
+              <w:t>A7</w:t>
+            </w:r>
+            <w:r>
+              <w:rPr>
+                <w:rFonts w:ascii="Microsoft YaHei" w:hAnsi="Microsoft YaHei" w:eastAsia="Microsoft YaHei"/>
+                <w:sz w:val="19"/>
+              </w:rPr>
+              <w:t>（</w:t>
+            </w:r>
+            <w:r>
+              <w:rPr>
+                <w:rFonts w:ascii="Consolas" w:hAnsi="Consolas" w:eastAsia="Consolas"/>
+                <w:color w:val="B03020"/>
+                <w:sz w:val="18"/>
+              </w:rPr>
+              <w:t>createIndex</w:t>
+            </w:r>
+            <w:r>
+              <w:rPr>
+                <w:rFonts w:ascii="Microsoft YaHei" w:hAnsi="Microsoft YaHei" w:eastAsia="Microsoft YaHei"/>
+                <w:sz w:val="19"/>
+              </w:rPr>
+              <w:t xml:space="preserve"> 是否可用）</w:t>
+            </w:r>
+          </w:p>
+        </w:tc>
+        <w:tc>
+          <w:tcPr>
+            <w:tcW w:type="dxa" w:w="2466"/>
+          </w:tcPr>
+          <w:p>
+            <w:r/>
+            <w:r>
+              <w:rPr>
+                <w:rFonts w:ascii="Microsoft YaHei" w:hAnsi="Microsoft YaHei" w:eastAsia="Microsoft YaHei"/>
+                <w:sz w:val="19"/>
+              </w:rPr>
+              <w:t xml:space="preserve">❌ </w:t>
+            </w:r>
+            <w:r>
+              <w:rPr>
+                <w:rFonts w:ascii="Microsoft YaHei" w:hAnsi="Microsoft YaHei" w:eastAsia="Microsoft YaHei"/>
+                <w:b/>
+                <w:sz w:val="19"/>
+              </w:rPr>
+              <w:t>不支持</w:t>
+            </w:r>
+          </w:p>
+        </w:tc>
+        <w:tc>
+          <w:tcPr>
+            <w:tcW w:type="dxa" w:w="2466"/>
+          </w:tcPr>
+          <w:p>
+            <w:r/>
+            <w:r>
+              <w:rPr>
+                <w:rFonts w:ascii="Consolas" w:hAnsi="Consolas" w:eastAsia="Consolas"/>
+                <w:color w:val="B03020"/>
+                <w:sz w:val="18"/>
+              </w:rPr>
+              <w:t>createIndex.typeof = "undefined"</w:t>
+            </w:r>
+            <w:r>
+              <w:rPr>
+                <w:rFonts w:ascii="Microsoft YaHei" w:hAnsi="Microsoft YaHei" w:eastAsia="Microsoft YaHei"/>
+                <w:sz w:val="19"/>
+              </w:rPr>
+              <w:t>；插入重复值</w:t>
+            </w:r>
+            <w:r>
+              <w:rPr>
+                <w:rFonts w:ascii="Microsoft YaHei" w:hAnsi="Microsoft YaHei" w:eastAsia="Microsoft YaHei"/>
+                <w:b/>
+                <w:sz w:val="19"/>
+              </w:rPr>
+              <w:t>未报错</w:t>
+            </w:r>
+          </w:p>
+        </w:tc>
+        <w:tc>
+          <w:tcPr>
+            <w:tcW w:type="dxa" w:w="2466"/>
+          </w:tcPr>
+          <w:p>
+            <w:r/>
+            <w:r>
+              <w:rPr>
+                <w:rFonts w:ascii="Microsoft YaHei" w:hAnsi="Microsoft YaHei" w:eastAsia="Microsoft YaHei"/>
+                <w:sz w:val="19"/>
+              </w:rPr>
+              <w:t>索引</w:t>
+            </w:r>
+            <w:r>
+              <w:rPr>
+                <w:rFonts w:ascii="Microsoft YaHei" w:hAnsi="Microsoft YaHei" w:eastAsia="Microsoft YaHei"/>
+                <w:b/>
+                <w:sz w:val="19"/>
+              </w:rPr>
+              <w:t>只能控制台手工建</w:t>
+            </w:r>
+            <w:r>
+              <w:rPr>
+                <w:rFonts w:ascii="Microsoft YaHei" w:hAnsi="Microsoft YaHei" w:eastAsia="Microsoft YaHei"/>
+                <w:sz w:val="19"/>
+              </w:rPr>
+              <w:t>；</w:t>
+            </w:r>
+            <w:r>
+              <w:rPr>
+                <w:rFonts w:ascii="Consolas" w:hAnsi="Consolas" w:eastAsia="Consolas"/>
+                <w:color w:val="B03020"/>
+                <w:sz w:val="18"/>
+              </w:rPr>
+              <w:t>initDb</w:t>
+            </w:r>
+            <w:r>
+              <w:rPr>
+                <w:rFonts w:ascii="Microsoft YaHei" w:hAnsi="Microsoft YaHei" w:eastAsia="Microsoft YaHei"/>
+                <w:sz w:val="19"/>
+              </w:rPr>
+              <w:t xml:space="preserve"> 的 39 条索引属预期内失败</w:t>
+            </w:r>
+          </w:p>
+        </w:tc>
+      </w:tr>
+      <w:tr>
+        <w:tc>
+          <w:tcPr>
+            <w:tcW w:type="dxa" w:w="2466"/>
+          </w:tcPr>
+          <w:p>
+            <w:r/>
+            <w:r>
+              <w:rPr>
+                <w:rFonts w:ascii="Microsoft YaHei" w:hAnsi="Microsoft YaHei" w:eastAsia="Microsoft YaHei"/>
+                <w:b/>
+                <w:sz w:val="19"/>
+              </w:rPr>
+              <w:t>A6</w:t>
+            </w:r>
+            <w:r>
+              <w:rPr>
+                <w:rFonts w:ascii="Microsoft YaHei" w:hAnsi="Microsoft YaHei" w:eastAsia="Microsoft YaHei"/>
+                <w:sz w:val="19"/>
+              </w:rPr>
+              <w:t>（首建档是否原子）</w:t>
+            </w:r>
+          </w:p>
+        </w:tc>
+        <w:tc>
+          <w:tcPr>
+            <w:tcW w:type="dxa" w:w="2466"/>
+          </w:tcPr>
+          <w:p>
+            <w:r/>
+            <w:r>
+              <w:rPr>
+                <w:rFonts w:ascii="Microsoft YaHei" w:hAnsi="Microsoft YaHei" w:eastAsia="Microsoft YaHei"/>
+                <w:sz w:val="19"/>
+              </w:rPr>
+              <w:t xml:space="preserve">⚠️ </w:t>
+            </w:r>
+            <w:r>
+              <w:rPr>
+                <w:rFonts w:ascii="Microsoft YaHei" w:hAnsi="Microsoft YaHei" w:eastAsia="Microsoft YaHei"/>
+                <w:b/>
+                <w:sz w:val="19"/>
+              </w:rPr>
+              <w:t>升级为「可能重复账号」</w:t>
+            </w:r>
+          </w:p>
+        </w:tc>
+        <w:tc>
+          <w:tcPr>
+            <w:tcW w:type="dxa" w:w="2466"/>
+          </w:tcPr>
+          <w:p>
+            <w:r/>
+            <w:r>
+              <w:rPr>
+                <w:rFonts w:ascii="Microsoft YaHei" w:hAnsi="Microsoft YaHei" w:eastAsia="Microsoft YaHei"/>
+                <w:sz w:val="19"/>
+              </w:rPr>
+              <w:t>同上（unique 索引建不了 ⇒ 无唯一约束）</w:t>
+            </w:r>
+          </w:p>
+        </w:tc>
+        <w:tc>
+          <w:tcPr>
+            <w:tcW w:type="dxa" w:w="2466"/>
+          </w:tcPr>
+          <w:p>
+            <w:r/>
+            <w:r>
+              <w:rPr>
+                <w:rFonts w:ascii="Microsoft YaHei" w:hAnsi="Microsoft YaHei" w:eastAsia="Microsoft YaHei"/>
+                <w:b/>
+                <w:sz w:val="19"/>
+              </w:rPr>
+              <w:t>首建档必须加 unique 冲突重试</w:t>
+            </w:r>
+            <w:r>
+              <w:rPr>
+                <w:rFonts w:ascii="Microsoft YaHei" w:hAnsi="Microsoft YaHei" w:eastAsia="Microsoft YaHei"/>
+                <w:sz w:val="19"/>
+              </w:rPr>
+              <w:t>，或改用其他去重手段</w:t>
+            </w:r>
+          </w:p>
+        </w:tc>
+      </w:tr>
+      <w:tr>
+        <w:tc>
+          <w:tcPr>
+            <w:tcW w:type="dxa" w:w="2466"/>
+          </w:tcPr>
+          <w:p>
+            <w:r/>
+            <w:r>
+              <w:rPr>
+                <w:rFonts w:ascii="Microsoft YaHei" w:hAnsi="Microsoft YaHei" w:eastAsia="Microsoft YaHei"/>
+                <w:sz w:val="19"/>
+              </w:rPr>
+              <w:t>**</w:t>
+            </w:r>
+            <w:r>
+              <w:rPr>
+                <w:rFonts w:ascii="Consolas" w:hAnsi="Consolas" w:eastAsia="Consolas"/>
+                <w:color w:val="B03020"/>
+                <w:sz w:val="18"/>
+              </w:rPr>
+              <w:t>require('./common')</w:t>
+            </w:r>
+            <w:r>
+              <w:rPr>
+                <w:rFonts w:ascii="Microsoft YaHei" w:hAnsi="Microsoft YaHei" w:eastAsia="Microsoft YaHei"/>
+                <w:sz w:val="19"/>
+              </w:rPr>
+              <w:t>**</w:t>
+            </w:r>
+          </w:p>
+        </w:tc>
+        <w:tc>
+          <w:tcPr>
+            <w:tcW w:type="dxa" w:w="2466"/>
+          </w:tcPr>
+          <w:p>
+            <w:r/>
+            <w:r>
+              <w:rPr>
+                <w:rFonts w:ascii="Microsoft YaHei" w:hAnsi="Microsoft YaHei" w:eastAsia="Microsoft YaHei"/>
+                <w:sz w:val="19"/>
+              </w:rPr>
+              <w:t xml:space="preserve">✅ </w:t>
+            </w:r>
+            <w:r>
+              <w:rPr>
+                <w:rFonts w:ascii="Microsoft YaHei" w:hAnsi="Microsoft YaHei" w:eastAsia="Microsoft YaHei"/>
+                <w:b/>
+                <w:sz w:val="19"/>
+              </w:rPr>
+              <w:t>可行，但必须扁平化</w:t>
+            </w:r>
+          </w:p>
+        </w:tc>
+        <w:tc>
+          <w:tcPr>
+            <w:tcW w:type="dxa" w:w="2466"/>
+          </w:tcPr>
+          <w:p>
+            <w:r/>
+            <w:r>
+              <w:rPr>
+                <w:rFonts w:ascii="Microsoft YaHei" w:hAnsi="Microsoft YaHei" w:eastAsia="Microsoft YaHei"/>
+                <w:sz w:val="19"/>
+              </w:rPr>
+              <w:t xml:space="preserve">子目录方案 </w:t>
+            </w:r>
+            <w:r>
+              <w:rPr>
+                <w:rFonts w:ascii="Consolas" w:hAnsi="Consolas" w:eastAsia="Consolas"/>
+                <w:color w:val="B03020"/>
+                <w:sz w:val="18"/>
+              </w:rPr>
+              <w:t>MODULE_NOT_FOUND</w:t>
+            </w:r>
+            <w:r>
+              <w:rPr>
+                <w:rFonts w:ascii="Microsoft YaHei" w:hAnsi="Microsoft YaHei" w:eastAsia="Microsoft YaHei"/>
+                <w:sz w:val="19"/>
+              </w:rPr>
+              <w:t xml:space="preserve">（云端 </w:t>
+            </w:r>
+            <w:r>
+              <w:rPr>
+                <w:rFonts w:ascii="Consolas" w:hAnsi="Consolas" w:eastAsia="Consolas"/>
+                <w:color w:val="B03020"/>
+                <w:sz w:val="18"/>
+              </w:rPr>
+              <w:t>fsDiag.hasCommonDir=false</w:t>
+            </w:r>
+            <w:r>
+              <w:rPr>
+                <w:rFonts w:ascii="Microsoft YaHei" w:hAnsi="Microsoft YaHei" w:eastAsia="Microsoft YaHei"/>
+                <w:sz w:val="19"/>
+              </w:rPr>
+              <w:t xml:space="preserve">，子目录被拼成 </w:t>
+            </w:r>
+            <w:r>
+              <w:rPr>
+                <w:rFonts w:ascii="Consolas" w:hAnsi="Consolas" w:eastAsia="Consolas"/>
+                <w:color w:val="B03020"/>
+                <w:sz w:val="18"/>
+              </w:rPr>
+              <w:t>common\xxx.js</w:t>
+            </w:r>
+            <w:r>
+              <w:rPr>
+                <w:rFonts w:ascii="Microsoft YaHei" w:hAnsi="Microsoft YaHei" w:eastAsia="Microsoft YaHei"/>
+                <w:sz w:val="19"/>
+              </w:rPr>
+              <w:t xml:space="preserve"> 扁平怪名）；改 </w:t>
+            </w:r>
+            <w:r>
+              <w:rPr>
+                <w:rFonts w:ascii="Consolas" w:hAnsi="Consolas" w:eastAsia="Consolas"/>
+                <w:color w:val="B03020"/>
+                <w:sz w:val="18"/>
+              </w:rPr>
+              <w:t>common.js</w:t>
+            </w:r>
+            <w:r>
+              <w:rPr>
+                <w:rFonts w:ascii="Microsoft YaHei" w:hAnsi="Microsoft YaHei" w:eastAsia="Microsoft YaHei"/>
+                <w:sz w:val="19"/>
+              </w:rPr>
+              <w:t xml:space="preserve"> + </w:t>
+            </w:r>
+            <w:r>
+              <w:rPr>
+                <w:rFonts w:ascii="Consolas" w:hAnsi="Consolas" w:eastAsia="Consolas"/>
+                <w:color w:val="B03020"/>
+                <w:sz w:val="18"/>
+              </w:rPr>
+              <w:t>cx_*.js</w:t>
+            </w:r>
+            <w:r>
+              <w:rPr>
+                <w:rFonts w:ascii="Microsoft YaHei" w:hAnsi="Microsoft YaHei" w:eastAsia="Microsoft YaHei"/>
+                <w:sz w:val="19"/>
+              </w:rPr>
+              <w:t xml:space="preserve"> 后 </w:t>
+            </w:r>
+            <w:r>
+              <w:rPr>
+                <w:rFonts w:ascii="Consolas" w:hAnsi="Consolas" w:eastAsia="Consolas"/>
+                <w:color w:val="B03020"/>
+                <w:sz w:val="18"/>
+              </w:rPr>
+              <w:t>ok:true</w:t>
+            </w:r>
+            <w:r>
+              <w:rPr>
+                <w:rFonts w:ascii="Microsoft YaHei" w:hAnsi="Microsoft YaHei" w:eastAsia="Microsoft YaHei"/>
+                <w:sz w:val="19"/>
+              </w:rPr>
+              <w:t>，13 项导出齐</w:t>
+            </w:r>
+          </w:p>
+        </w:tc>
+        <w:tc>
+          <w:tcPr>
+            <w:tcW w:type="dxa" w:w="2466"/>
+          </w:tcPr>
+          <w:p>
+            <w:r/>
+            <w:r>
+              <w:rPr>
+                <w:rFonts w:ascii="Microsoft YaHei" w:hAnsi="Microsoft YaHei" w:eastAsia="Microsoft YaHei"/>
+                <w:b/>
+                <w:sz w:val="19"/>
+              </w:rPr>
+              <w:t>云函数包内禁用子目录</w:t>
+            </w:r>
+            <w:r>
+              <w:rPr>
+                <w:rFonts w:ascii="Microsoft YaHei" w:hAnsi="Microsoft YaHei" w:eastAsia="Microsoft YaHei"/>
+                <w:sz w:val="19"/>
+              </w:rPr>
+              <w:t xml:space="preserve">；改 common 单源后必跑 </w:t>
+            </w:r>
+            <w:r>
+              <w:rPr>
+                <w:rFonts w:ascii="Consolas" w:hAnsi="Consolas" w:eastAsia="Consolas"/>
+                <w:color w:val="B03020"/>
+                <w:sz w:val="18"/>
+              </w:rPr>
+              <w:t>node tools/sync_common.js</w:t>
+            </w:r>
+          </w:p>
+        </w:tc>
+      </w:tr>
+      <w:tr>
+        <w:tc>
+          <w:tcPr>
+            <w:tcW w:type="dxa" w:w="2466"/>
+          </w:tcPr>
+          <w:p>
+            <w:r/>
+            <w:r>
+              <w:rPr>
+                <w:rFonts w:ascii="Microsoft YaHei" w:hAnsi="Microsoft YaHei" w:eastAsia="Microsoft YaHei"/>
+                <w:sz w:val="19"/>
+              </w:rPr>
+              <w:t>**</w:t>
+            </w:r>
+            <w:r>
+              <w:rPr>
+                <w:rFonts w:ascii="Consolas" w:hAnsi="Consolas" w:eastAsia="Consolas"/>
+                <w:color w:val="B03020"/>
+                <w:sz w:val="18"/>
+              </w:rPr>
+              <w:t>doc().get()</w:t>
+            </w:r>
+            <w:r>
+              <w:rPr>
+                <w:rFonts w:ascii="Microsoft YaHei" w:hAnsi="Microsoft YaHei" w:eastAsia="Microsoft YaHei"/>
+                <w:sz w:val="19"/>
+              </w:rPr>
+              <w:t xml:space="preserve"> 契约**</w:t>
+            </w:r>
+          </w:p>
+        </w:tc>
+        <w:tc>
+          <w:tcPr>
+            <w:tcW w:type="dxa" w:w="2466"/>
+          </w:tcPr>
+          <w:p>
+            <w:r/>
+            <w:r>
+              <w:rPr>
+                <w:rFonts w:ascii="Microsoft YaHei" w:hAnsi="Microsoft YaHei" w:eastAsia="Microsoft YaHei"/>
+                <w:sz w:val="19"/>
+              </w:rPr>
+              <w:t xml:space="preserve">✅ </w:t>
+            </w:r>
+            <w:r>
+              <w:rPr>
+                <w:rFonts w:ascii="Microsoft YaHei" w:hAnsi="Microsoft YaHei" w:eastAsia="Microsoft YaHei"/>
+                <w:b/>
+                <w:sz w:val="19"/>
+              </w:rPr>
+              <w:t>成立（A1/A2 未修反）</w:t>
+            </w:r>
+          </w:p>
+        </w:tc>
+        <w:tc>
+          <w:tcPr>
+            <w:tcW w:type="dxa" w:w="2466"/>
+          </w:tcPr>
+          <w:p>
+            <w:r/>
+            <w:r>
+              <w:rPr>
+                <w:rFonts w:ascii="Consolas" w:hAnsi="Consolas" w:eastAsia="Consolas"/>
+                <w:color w:val="B03020"/>
+                <w:sz w:val="18"/>
+              </w:rPr>
+              <w:t>topLevelKeys=["data","errMsg"]</w:t>
+            </w:r>
+            <w:r>
+              <w:rPr>
+                <w:rFonts w:ascii="Microsoft YaHei" w:hAnsi="Microsoft YaHei" w:eastAsia="Microsoft YaHei"/>
+                <w:sz w:val="19"/>
+              </w:rPr>
+              <w:t>、</w:t>
+            </w:r>
+            <w:r>
+              <w:rPr>
+                <w:rFonts w:ascii="Consolas" w:hAnsi="Consolas" w:eastAsia="Consolas"/>
+                <w:color w:val="B03020"/>
+                <w:sz w:val="18"/>
+              </w:rPr>
+              <w:t>hasDataField=true</w:t>
+            </w:r>
+            <w:r>
+              <w:rPr>
+                <w:rFonts w:ascii="Microsoft YaHei" w:hAnsi="Microsoft YaHei" w:eastAsia="Microsoft YaHei"/>
+                <w:sz w:val="19"/>
+              </w:rPr>
+              <w:t>；文档不存在时 **</w:t>
+            </w:r>
+            <w:r>
+              <w:rPr>
+                <w:rFonts w:ascii="Consolas" w:hAnsi="Consolas" w:eastAsia="Consolas"/>
+                <w:color w:val="B03020"/>
+                <w:sz w:val="18"/>
+              </w:rPr>
+              <w:t>behavior:"reject"</w:t>
+            </w:r>
+            <w:r>
+              <w:rPr>
+                <w:rFonts w:ascii="Microsoft YaHei" w:hAnsi="Microsoft YaHei" w:eastAsia="Microsoft YaHei"/>
+                <w:sz w:val="19"/>
+              </w:rPr>
+              <w:t>**</w:t>
+            </w:r>
+          </w:p>
+        </w:tc>
+        <w:tc>
+          <w:tcPr>
+            <w:tcW w:type="dxa" w:w="2466"/>
+          </w:tcPr>
+          <w:p>
+            <w:r/>
+            <w:r>
+              <w:rPr>
+                <w:rFonts w:ascii="Microsoft YaHei" w:hAnsi="Microsoft YaHei" w:eastAsia="Microsoft YaHei"/>
+                <w:sz w:val="19"/>
+              </w:rPr>
+              <w:t xml:space="preserve">取值**必须取 </w:t>
+            </w:r>
+            <w:r>
+              <w:rPr>
+                <w:rFonts w:ascii="Consolas" w:hAnsi="Consolas" w:eastAsia="Consolas"/>
+                <w:color w:val="B03020"/>
+                <w:sz w:val="18"/>
+              </w:rPr>
+              <w:t>.data</w:t>
+            </w:r>
+            <w:r>
+              <w:rPr>
+                <w:rFonts w:ascii="Microsoft YaHei" w:hAnsi="Microsoft YaHei" w:eastAsia="Microsoft YaHei"/>
+                <w:b/>
+                <w:sz w:val="19"/>
+              </w:rPr>
+              <w:t>；读取</w:t>
+            </w:r>
+            <w:r>
+              <w:rPr>
+                <w:rFonts w:ascii="Microsoft YaHei" w:hAnsi="Microsoft YaHei" w:eastAsia="Microsoft YaHei"/>
+                <w:sz w:val="19"/>
+              </w:rPr>
+              <w:t>必须 try/catch**（不存在会抛，不是返回 null）</w:t>
+            </w:r>
+          </w:p>
+        </w:tc>
+      </w:tr>
+      <w:tr>
+        <w:tc>
+          <w:tcPr>
+            <w:tcW w:type="dxa" w:w="2466"/>
+          </w:tcPr>
+          <w:p>
+            <w:r/>
+            <w:r>
+              <w:rPr>
+                <w:rFonts w:ascii="Microsoft YaHei" w:hAnsi="Microsoft YaHei" w:eastAsia="Microsoft YaHei"/>
+                <w:sz w:val="19"/>
+              </w:rPr>
+              <w:t>A1 落点（</w:t>
+            </w:r>
+            <w:r>
+              <w:rPr>
+                <w:rFonts w:ascii="Consolas" w:hAnsi="Consolas" w:eastAsia="Consolas"/>
+                <w:color w:val="B03020"/>
+                <w:sz w:val="18"/>
+              </w:rPr>
+              <w:t>assertShopOwner</w:t>
+            </w:r>
+            <w:r>
+              <w:rPr>
+                <w:rFonts w:ascii="Microsoft YaHei" w:hAnsi="Microsoft YaHei" w:eastAsia="Microsoft YaHei"/>
+                <w:sz w:val="19"/>
+              </w:rPr>
+              <w:t>）</w:t>
+            </w:r>
+          </w:p>
+        </w:tc>
+        <w:tc>
+          <w:tcPr>
+            <w:tcW w:type="dxa" w:w="2466"/>
+          </w:tcPr>
+          <w:p>
+            <w:r/>
+            <w:r>
+              <w:rPr>
+                <w:rFonts w:ascii="Microsoft YaHei" w:hAnsi="Microsoft YaHei" w:eastAsia="Microsoft YaHei"/>
+                <w:sz w:val="19"/>
+              </w:rPr>
+              <w:t>✅ 正确</w:t>
+            </w:r>
+          </w:p>
+        </w:tc>
+        <w:tc>
+          <w:tcPr>
+            <w:tcW w:type="dxa" w:w="2466"/>
+          </w:tcPr>
+          <w:p>
+            <w:r/>
+            <w:r>
+              <w:rPr>
+                <w:rFonts w:ascii="Microsoft YaHei" w:hAnsi="Microsoft YaHei" w:eastAsia="Microsoft YaHei"/>
+                <w:sz w:val="19"/>
+              </w:rPr>
+              <w:t xml:space="preserve">不存在的店铺返回 </w:t>
+            </w:r>
+            <w:r>
+              <w:rPr>
+                <w:rFonts w:ascii="Consolas" w:hAnsi="Consolas" w:eastAsia="Consolas"/>
+                <w:color w:val="B03020"/>
+                <w:sz w:val="18"/>
+              </w:rPr>
+              <w:t>{code:"RESOURCE_NOT_FOUND"}</w:t>
+            </w:r>
+            <w:r>
+              <w:rPr>
+                <w:rFonts w:ascii="Microsoft YaHei" w:hAnsi="Microsoft YaHei" w:eastAsia="Microsoft YaHei"/>
+                <w:sz w:val="19"/>
+              </w:rPr>
+              <w:t>，</w:t>
+            </w:r>
+            <w:r>
+              <w:rPr>
+                <w:rFonts w:ascii="Microsoft YaHei" w:hAnsi="Microsoft YaHei" w:eastAsia="Microsoft YaHei"/>
+                <w:b/>
+                <w:sz w:val="19"/>
+              </w:rPr>
+              <w:t>非抛异常、非恒 FORBIDDEN</w:t>
+            </w:r>
+          </w:p>
+        </w:tc>
+        <w:tc>
+          <w:tcPr>
+            <w:tcW w:type="dxa" w:w="2466"/>
+          </w:tcPr>
+          <w:p>
+            <w:r/>
+            <w:r>
+              <w:rPr>
+                <w:rFonts w:ascii="Microsoft YaHei" w:hAnsi="Microsoft YaHei" w:eastAsia="Microsoft YaHei"/>
+                <w:sz w:val="19"/>
+              </w:rPr>
+              <w:t>A1 修法确认无误</w:t>
+            </w:r>
+          </w:p>
+        </w:tc>
+      </w:tr>
+      <w:tr>
+        <w:tc>
+          <w:tcPr>
+            <w:tcW w:type="dxa" w:w="2466"/>
+          </w:tcPr>
+          <w:p>
+            <w:r/>
+            <w:r>
+              <w:rPr>
+                <w:rFonts w:ascii="Microsoft YaHei" w:hAnsi="Microsoft YaHei" w:eastAsia="Microsoft YaHei"/>
+                <w:sz w:val="19"/>
+              </w:rPr>
+              <w:t>A2 落点（</w:t>
+            </w:r>
+            <w:r>
+              <w:rPr>
+                <w:rFonts w:ascii="Consolas" w:hAnsi="Consolas" w:eastAsia="Consolas"/>
+                <w:color w:val="B03020"/>
+                <w:sz w:val="18"/>
+              </w:rPr>
+              <w:t>dataAdapter.get</w:t>
+            </w:r>
+            <w:r>
+              <w:rPr>
+                <w:rFonts w:ascii="Microsoft YaHei" w:hAnsi="Microsoft YaHei" w:eastAsia="Microsoft YaHei"/>
+                <w:sz w:val="19"/>
+              </w:rPr>
+              <w:t>）</w:t>
+            </w:r>
+          </w:p>
+        </w:tc>
+        <w:tc>
+          <w:tcPr>
+            <w:tcW w:type="dxa" w:w="2466"/>
+          </w:tcPr>
+          <w:p>
+            <w:r/>
+            <w:r>
+              <w:rPr>
+                <w:rFonts w:ascii="Microsoft YaHei" w:hAnsi="Microsoft YaHei" w:eastAsia="Microsoft YaHei"/>
+                <w:sz w:val="19"/>
+              </w:rPr>
+              <w:t>✅ 正确</w:t>
+            </w:r>
+          </w:p>
+        </w:tc>
+        <w:tc>
+          <w:tcPr>
+            <w:tcW w:type="dxa" w:w="2466"/>
+          </w:tcPr>
+          <w:p>
+            <w:r/>
+            <w:r>
+              <w:rPr>
+                <w:rFonts w:ascii="Consolas" w:hAnsi="Consolas" w:eastAsia="Consolas"/>
+                <w:color w:val="B03020"/>
+                <w:sz w:val="18"/>
+              </w:rPr>
+              <w:t>liveIsDoc:true</w:t>
+            </w:r>
+            <w:r>
+              <w:rPr>
+                <w:rFonts w:ascii="Microsoft YaHei" w:hAnsi="Microsoft YaHei" w:eastAsia="Microsoft YaHei"/>
+                <w:sz w:val="19"/>
+              </w:rPr>
+              <w:t>（未删返回文档）、</w:t>
+            </w:r>
+            <w:r>
+              <w:rPr>
+                <w:rFonts w:ascii="Consolas" w:hAnsi="Consolas" w:eastAsia="Consolas"/>
+                <w:color w:val="B03020"/>
+                <w:sz w:val="18"/>
+              </w:rPr>
+              <w:t>deadIsNull:true</w:t>
+            </w:r>
+            <w:r>
+              <w:rPr>
+                <w:rFonts w:ascii="Microsoft YaHei" w:hAnsi="Microsoft YaHei" w:eastAsia="Microsoft YaHei"/>
+                <w:sz w:val="19"/>
+              </w:rPr>
+              <w:t>（软删返回 null）</w:t>
+            </w:r>
+          </w:p>
+        </w:tc>
+        <w:tc>
+          <w:tcPr>
+            <w:tcW w:type="dxa" w:w="2466"/>
+          </w:tcPr>
+          <w:p>
+            <w:r/>
+            <w:r>
+              <w:rPr>
+                <w:rFonts w:ascii="Microsoft YaHei" w:hAnsi="Microsoft YaHei" w:eastAsia="Microsoft YaHei"/>
+                <w:sz w:val="19"/>
+              </w:rPr>
+              <w:t>A2 修法确认无误</w:t>
+            </w:r>
+          </w:p>
+        </w:tc>
+      </w:tr>
+    </w:tbl>
+    <w:p/>
+    <w:p>
+      <w:pPr>
+        <w:ind w:left="270"/>
+        <w:shd w:val="clear" w:color="auto" w:fill="F2F2F2"/>
+      </w:pPr>
+      <w:r/>
+      <w:r>
+        <w:rPr>
+          <w:rFonts w:ascii="Microsoft YaHei" w:hAnsi="Microsoft YaHei" w:eastAsia="Microsoft YaHei"/>
+          <w:sz w:val="20"/>
+        </w:rPr>
+        <w:t>配套代码已落盘：</w:t>
+      </w:r>
+      <w:r>
+        <w:rPr>
+          <w:rFonts w:ascii="Consolas" w:hAnsi="Consolas" w:eastAsia="Consolas"/>
+          <w:color w:val="B03020"/>
+          <w:sz w:val="19"/>
+        </w:rPr>
         <w:t>cloudfunctions/smokeTest/</w:t>
       </w:r>
       <w:r>
@@ -46,7 +1228,37 @@
           <w:rFonts w:ascii="Microsoft YaHei" w:hAnsi="Microsoft YaHei" w:eastAsia="Microsoft YaHei"/>
           <w:sz w:val="20"/>
         </w:rPr>
-        <w:t xml:space="preserve">（index.js + package.json + 已 sync 的 common/ 副本）。本 Runbook 是给你在控制台照做的纸质流程。 ⚠️ </w:t>
+        <w:t xml:space="preserve">（index.js + package.json + 同步派生的 </w:t>
+      </w:r>
+      <w:r>
+        <w:rPr>
+          <w:rFonts w:ascii="Consolas" w:hAnsi="Consolas" w:eastAsia="Consolas"/>
+          <w:color w:val="B03020"/>
+          <w:sz w:val="19"/>
+        </w:rPr>
+        <w:t>common.js</w:t>
+      </w:r>
+      <w:r>
+        <w:rPr>
+          <w:rFonts w:ascii="Microsoft YaHei" w:hAnsi="Microsoft YaHei" w:eastAsia="Microsoft YaHei"/>
+          <w:sz w:val="20"/>
+        </w:rPr>
+        <w:t xml:space="preserve"> + </w:t>
+      </w:r>
+      <w:r>
+        <w:rPr>
+          <w:rFonts w:ascii="Consolas" w:hAnsi="Consolas" w:eastAsia="Consolas"/>
+          <w:color w:val="B03020"/>
+          <w:sz w:val="19"/>
+        </w:rPr>
+        <w:t>cx_*.js</w:t>
+      </w:r>
+      <w:r>
+        <w:rPr>
+          <w:rFonts w:ascii="Microsoft YaHei" w:hAnsi="Microsoft YaHei" w:eastAsia="Microsoft YaHei"/>
+          <w:sz w:val="20"/>
+        </w:rPr>
+        <w:t xml:space="preserve">）。本 Runbook 是给你在控制台照做的纸质流程。 ⚠️ </w:t>
       </w:r>
       <w:r>
         <w:rPr>
@@ -184,14 +1396,14 @@
           <w:b/>
           <w:sz w:val="21"/>
         </w:rPr>
-        <w:t>不要从头重跑本地 8 套件</w:t>
+        <w:t>不要从头重跑本地 9 套件</w:t>
       </w:r>
       <w:r>
         <w:rPr>
           <w:rFonts w:ascii="Microsoft YaHei" w:hAnsi="Microsoft YaHei" w:eastAsia="Microsoft YaHei"/>
           <w:sz w:val="21"/>
         </w:rPr>
-        <w:t xml:space="preserve">：HEAD 仍是 </w:t>
+        <w:t xml:space="preserve">：HEAD 以 </w:t>
       </w:r>
       <w:r>
         <w:rPr>
@@ -199,14 +1411,14 @@
           <w:color w:val="B03020"/>
           <w:sz w:val="20"/>
         </w:rPr>
-        <w:t>4ddcc5c</w:t>
+        <w:t>git log --oneline -1</w:t>
       </w:r>
       <w:r>
         <w:rPr>
           <w:rFonts w:ascii="Microsoft YaHei" w:hAnsi="Microsoft YaHei" w:eastAsia="Microsoft YaHei"/>
           <w:sz w:val="21"/>
         </w:rPr>
-        <w:t xml:space="preserve"> / dirty=0，同一棵树跑同一批套件只会得到同一结果（仪式不是验证）。本地层鉴别力已逐项用变异证明过。</w:t>
+        <w:t xml:space="preserve"> 为准（本 Runbook 不复制 commit —— 同一事实写两遍必然过期），同一棵树跑同一批套件只会得到同一结果（仪式不是验证）。本地层鉴别力已逐项用变异证明过。</w:t>
       </w:r>
     </w:p>
     <w:p>
@@ -402,7 +1614,7 @@
                 <w:color w:val="B03020"/>
                 <w:sz w:val="18"/>
               </w:rPr>
-              <w:t>cloud1-4dgphoxy337f2a25</w:t>
+              <w:t>cloud1-d4gphpoxy337f2a25</w:t>
             </w:r>
             <w:r>
               <w:rPr>
@@ -439,7 +1651,7 @@
                 <w:rFonts w:ascii="Microsoft YaHei" w:hAnsi="Microsoft YaHei" w:eastAsia="Microsoft YaHei"/>
                 <w:sz w:val="19"/>
               </w:rPr>
-              <w:t>需你的微信账号与云开发控制台；一次性问清 A7 / A6 / require 三悬案</w:t>
+              <w:t>需你的微信账号与云开发控制台；三悬案已于 2026-09-14~09-15 云端实测答完（见本文件「四前提终局结论」，第 11 行起）</w:t>
             </w:r>
           </w:p>
         </w:tc>
@@ -468,10 +1680,33 @@
             <w:r/>
             <w:r>
               <w:rPr>
+                <w:rFonts w:ascii="Consolas" w:hAnsi="Consolas" w:eastAsia="Consolas"/>
+                <w:color w:val="B03020"/>
+                <w:sz w:val="18"/>
+              </w:rPr>
+              <w:t>config/env.js</w:t>
+            </w:r>
+            <w:r>
+              <w:rPr>
                 <w:rFonts w:ascii="Microsoft YaHei" w:hAnsi="Microsoft YaHei" w:eastAsia="Microsoft YaHei"/>
                 <w:sz w:val="19"/>
               </w:rPr>
-              <w:t xml:space="preserve">替换 </w:t>
+              <w:t xml:space="preserve"> 的 </w:t>
+            </w:r>
+            <w:r>
+              <w:rPr>
+                <w:rFonts w:ascii="Microsoft YaHei" w:hAnsi="Microsoft YaHei" w:eastAsia="Microsoft YaHei"/>
+                <w:b/>
+                <w:sz w:val="19"/>
+              </w:rPr>
+              <w:t>dev 槽已填</w:t>
+            </w:r>
+            <w:r>
+              <w:rPr>
+                <w:rFonts w:ascii="Microsoft YaHei" w:hAnsi="Microsoft YaHei" w:eastAsia="Microsoft YaHei"/>
+                <w:sz w:val="19"/>
+              </w:rPr>
+              <w:t>（</w:t>
             </w:r>
             <w:r>
               <w:rPr>
@@ -479,14 +1714,29 @@
                 <w:color w:val="B03020"/>
                 <w:sz w:val="18"/>
               </w:rPr>
-              <w:t>miniprogram/config/env.js:14-15</w:t>
+              <w:t>cloud1-d4gphpoxy337f2a25</w:t>
             </w:r>
             <w:r>
               <w:rPr>
                 <w:rFonts w:ascii="Microsoft YaHei" w:hAnsi="Microsoft YaHei" w:eastAsia="Microsoft YaHei"/>
                 <w:sz w:val="19"/>
               </w:rPr>
-              <w:t xml:space="preserve"> 占位符为真实环境 ID</w:t>
+              <w:t xml:space="preserve">），仅 </w:t>
+            </w:r>
+            <w:r>
+              <w:rPr>
+                <w:rFonts w:ascii="Microsoft YaHei" w:hAnsi="Microsoft YaHei" w:eastAsia="Microsoft YaHei"/>
+                <w:b/>
+                <w:sz w:val="19"/>
+              </w:rPr>
+              <w:t>prod 槽</w:t>
+            </w:r>
+            <w:r>
+              <w:rPr>
+                <w:rFonts w:ascii="Microsoft YaHei" w:hAnsi="Microsoft YaHei" w:eastAsia="Microsoft YaHei"/>
+                <w:sz w:val="19"/>
+              </w:rPr>
+              <w:t>待建环境后替换</w:t>
             </w:r>
           </w:p>
         </w:tc>
@@ -501,7 +1751,7 @@
                 <w:rFonts w:ascii="Microsoft YaHei" w:hAnsi="Microsoft YaHei" w:eastAsia="Microsoft YaHei"/>
                 <w:sz w:val="19"/>
               </w:rPr>
-              <w:t>建完环境才有真值（判据④唯一未完项）</w:t>
+              <w:t>建完 prod 环境才有真值（判据④ dev 侧已闭环）</w:t>
             </w:r>
           </w:p>
         </w:tc>
@@ -660,7 +1910,22 @@
           <w:rFonts w:ascii="Microsoft YaHei" w:hAnsi="Microsoft YaHei" w:eastAsia="Microsoft YaHei"/>
           <w:sz w:val="21"/>
         </w:rPr>
-        <w:t xml:space="preserve"> 已就绪（含 </w:t>
+        <w:t xml:space="preserve"> 已就绪（</w:t>
+      </w:r>
+      <w:r>
+        <w:rPr>
+          <w:rFonts w:ascii="Microsoft YaHei" w:hAnsi="Microsoft YaHei" w:eastAsia="Microsoft YaHei"/>
+          <w:b/>
+          <w:sz w:val="21"/>
+        </w:rPr>
+        <w:t>扁平副本</w:t>
+      </w:r>
+      <w:r>
+        <w:rPr>
+          <w:rFonts w:ascii="Microsoft YaHei" w:hAnsi="Microsoft YaHei" w:eastAsia="Microsoft YaHei"/>
+          <w:sz w:val="21"/>
+        </w:rPr>
+        <w:t xml:space="preserve"> </w:t>
       </w:r>
       <w:r>
         <w:rPr>
@@ -668,14 +1933,29 @@
           <w:color w:val="B03020"/>
           <w:sz w:val="20"/>
         </w:rPr>
-        <w:t>common/</w:t>
+        <w:t>common.js</w:t>
       </w:r>
       <w:r>
         <w:rPr>
           <w:rFonts w:ascii="Microsoft YaHei" w:hAnsi="Microsoft YaHei" w:eastAsia="Microsoft YaHei"/>
           <w:sz w:val="21"/>
         </w:rPr>
-        <w:t xml:space="preserve"> 副本，由 </w:t>
+        <w:t xml:space="preserve"> + </w:t>
+      </w:r>
+      <w:r>
+        <w:rPr>
+          <w:rFonts w:ascii="Consolas" w:hAnsi="Consolas" w:eastAsia="Consolas"/>
+          <w:color w:val="B03020"/>
+          <w:sz w:val="20"/>
+        </w:rPr>
+        <w:t>cx_*.js</w:t>
+      </w:r>
+      <w:r>
+        <w:rPr>
+          <w:rFonts w:ascii="Microsoft YaHei" w:hAnsi="Microsoft YaHei" w:eastAsia="Microsoft YaHei"/>
+          <w:sz w:val="21"/>
+        </w:rPr>
+        <w:t xml:space="preserve">，无子目录，由 </w:t>
       </w:r>
       <w:r>
         <w:rPr>
@@ -776,7 +2056,22 @@
           <w:rFonts w:ascii="Microsoft YaHei" w:hAnsi="Microsoft YaHei" w:eastAsia="Microsoft YaHei"/>
           <w:sz w:val="21"/>
         </w:rPr>
-        <w:t xml:space="preserve"> 是 </w:t>
+        <w:t xml:space="preserve"> </w:t>
+      </w:r>
+      <w:r>
+        <w:rPr>
+          <w:rFonts w:ascii="Microsoft YaHei" w:hAnsi="Microsoft YaHei" w:eastAsia="Microsoft YaHei"/>
+          <w:b/>
+          <w:sz w:val="21"/>
+        </w:rPr>
+        <w:t>已是真值</w:t>
+      </w:r>
+      <w:r>
+        <w:rPr>
+          <w:rFonts w:ascii="Microsoft YaHei" w:hAnsi="Microsoft YaHei" w:eastAsia="Microsoft YaHei"/>
+          <w:sz w:val="21"/>
+        </w:rPr>
+        <w:t xml:space="preserve"> </w:t>
       </w:r>
       <w:r>
         <w:rPr>
@@ -784,29 +2079,44 @@
           <w:color w:val="B03020"/>
           <w:sz w:val="20"/>
         </w:rPr>
-        <w:t>"touristappid"</w:t>
+        <w:t>wx33c110dc57a9c8dc</w:t>
       </w:r>
       <w:r>
         <w:rPr>
           <w:rFonts w:ascii="Microsoft YaHei" w:hAnsi="Microsoft YaHei" w:eastAsia="Microsoft YaHei"/>
           <w:sz w:val="21"/>
         </w:rPr>
-        <w:t>（微信开发者工具的</w:t>
-      </w:r>
-      <w:r>
-        <w:rPr>
-          <w:rFonts w:ascii="Microsoft YaHei" w:hAnsi="Microsoft YaHei" w:eastAsia="Microsoft YaHei"/>
-          <w:b/>
+        <w:t>（</w:t>
+      </w:r>
+      <w:r>
+        <w:rPr>
+          <w:rFonts w:ascii="Consolas" w:hAnsi="Consolas" w:eastAsia="Consolas"/>
+          <w:color w:val="B03020"/>
+          <w:sz w:val="20"/>
+        </w:rPr>
+        <w:t>project.config.json:3</w:t>
+      </w:r>
+      <w:r>
+        <w:rPr>
+          <w:rFonts w:ascii="Microsoft YaHei" w:hAnsi="Microsoft YaHei" w:eastAsia="Microsoft YaHei"/>
           <w:sz w:val="21"/>
         </w:rPr>
-        <w:t>游客模式占位</w:t>
+        <w:t xml:space="preserve">）；若哪天它退回 </w:t>
+      </w:r>
+      <w:r>
+        <w:rPr>
+          <w:rFonts w:ascii="Consolas" w:hAnsi="Consolas" w:eastAsia="Consolas"/>
+          <w:color w:val="B03020"/>
+          <w:sz w:val="20"/>
+        </w:rPr>
+        <w:t>touristappid</w:t>
       </w:r>
       <w:r>
         <w:rPr>
           <w:rFonts w:ascii="Microsoft YaHei" w:hAnsi="Microsoft YaHei" w:eastAsia="Microsoft YaHei"/>
           <w:sz w:val="21"/>
         </w:rPr>
-        <w:t>）。</w:t>
+        <w:t xml:space="preserve"> 才需要替换。</w:t>
       </w:r>
     </w:p>
     <w:p>
@@ -1179,7 +2489,7 @@
           <w:b/>
           <w:sz w:val="21"/>
         </w:rPr>
-        <w:t>9 个 unique 索引</w:t>
+        <w:t>10 个 unique 索引</w:t>
       </w:r>
       <w:r>
         <w:rPr>
@@ -1260,7 +2570,7 @@
           <w:color w:val="B03020"/>
           <w:sz w:val="19"/>
         </w:rPr>
-        <w:t>shop_cost_card.card_code</w:t>
+        <w:t>shop_inventory.(shop_id,month)</w:t>
       </w:r>
       <w:r>
         <w:rPr>
@@ -1275,7 +2585,7 @@
           <w:color w:val="B03020"/>
           <w:sz w:val="19"/>
         </w:rPr>
-        <w:t>shop_switch.(shop_id,switch_key)</w:t>
+        <w:t>shop_cost_card.card_code</w:t>
       </w:r>
       <w:r>
         <w:rPr>
@@ -1290,7 +2600,7 @@
           <w:color w:val="B03020"/>
           <w:sz w:val="19"/>
         </w:rPr>
-        <w:t>admin_user.username</w:t>
+        <w:t>shop_switch.(shop_id,switch_key)</w:t>
       </w:r>
       <w:r>
         <w:rPr>
@@ -1302,6 +2612,21 @@
     </w:p>
     <w:p>
       <w:r/>
+      <w:r>
+        <w:rPr>
+          <w:rFonts w:ascii="Consolas" w:hAnsi="Consolas" w:eastAsia="Consolas"/>
+          <w:color w:val="B03020"/>
+          <w:sz w:val="19"/>
+        </w:rPr>
+        <w:t>admin_user.username</w:t>
+      </w:r>
+      <w:r>
+        <w:rPr>
+          <w:rFonts w:ascii="Microsoft YaHei" w:hAnsi="Microsoft YaHei" w:eastAsia="Microsoft YaHei"/>
+          <w:sz w:val="20"/>
+        </w:rPr>
+        <w:t xml:space="preserve"> / </w:t>
+      </w:r>
       <w:r>
         <w:rPr>
           <w:rFonts w:ascii="Consolas" w:hAnsi="Consolas" w:eastAsia="Consolas"/>
@@ -1336,7 +2661,7 @@
           <w:rFonts w:ascii="Microsoft YaHei" w:hAnsi="Microsoft YaHei" w:eastAsia="Microsoft YaHei"/>
           <w:sz w:val="21"/>
         </w:rPr>
-        <w:t>判读：</w:t>
+        <w:t xml:space="preserve">判读（A7 已于 2026-09-14 定案 = </w:t>
       </w:r>
       <w:r>
         <w:rPr>
@@ -1344,14 +2669,44 @@
           <w:b/>
           <w:sz w:val="21"/>
         </w:rPr>
-        <w:t>全在</w:t>
+        <w:t>不支持</w:t>
       </w:r>
       <w:r>
         <w:rPr>
           <w:rFonts w:ascii="Microsoft YaHei" w:hAnsi="Microsoft YaHei" w:eastAsia="Microsoft YaHei"/>
           <w:sz w:val="21"/>
         </w:rPr>
-        <w:t xml:space="preserve"> → A7=支持，A6（首建档非原子）风险=偶发失败一次，可缓；</w:t>
+        <w:t>）：10 条 unique 全在 → A6 风险低；</w:t>
+      </w:r>
+      <w:r>
+        <w:rPr>
+          <w:rFonts w:ascii="Microsoft YaHei" w:hAnsi="Microsoft YaHei" w:eastAsia="Microsoft YaHei"/>
+          <w:b/>
+          <w:sz w:val="21"/>
+        </w:rPr>
+        <w:t>有缺失</w:t>
+      </w:r>
+      <w:r>
+        <w:rPr>
+          <w:rFonts w:ascii="Microsoft YaHei" w:hAnsi="Microsoft YaHei" w:eastAsia="Microsoft YaHei"/>
+          <w:sz w:val="21"/>
+        </w:rPr>
+        <w:t xml:space="preserve"> → 按「工序 5.5」控制台</w:t>
+      </w:r>
+      <w:r>
+        <w:rPr>
+          <w:rFonts w:ascii="Microsoft YaHei" w:hAnsi="Microsoft YaHei" w:eastAsia="Microsoft YaHei"/>
+          <w:b/>
+          <w:sz w:val="21"/>
+        </w:rPr>
+        <w:t>手工补建</w:t>
+      </w:r>
+      <w:r>
+        <w:rPr>
+          <w:rFonts w:ascii="Microsoft YaHei" w:hAnsi="Microsoft YaHei" w:eastAsia="Microsoft YaHei"/>
+          <w:sz w:val="21"/>
+        </w:rPr>
+        <w:t>，</w:t>
       </w:r>
     </w:p>
     <w:p>
@@ -1359,17 +2714,34 @@
       <w:r>
         <w:rPr>
           <w:rFonts w:ascii="Microsoft YaHei" w:hAnsi="Microsoft YaHei" w:eastAsia="Microsoft YaHei"/>
+          <w:sz w:val="20"/>
+        </w:rPr>
+        <w:t>在补齐前 A6 按「</w:t>
+      </w:r>
+      <w:r>
+        <w:rPr>
+          <w:rFonts w:ascii="Microsoft YaHei" w:hAnsi="Microsoft YaHei" w:eastAsia="Microsoft YaHei"/>
           <w:b/>
           <w:sz w:val="20"/>
         </w:rPr>
-        <w:t>有缺失</w:t>
+        <w:t>可能产生重复账号</w:t>
       </w:r>
       <w:r>
         <w:rPr>
           <w:rFonts w:ascii="Microsoft YaHei" w:hAnsi="Microsoft YaHei" w:eastAsia="Microsoft YaHei"/>
           <w:sz w:val="20"/>
         </w:rPr>
-        <w:t xml:space="preserve"> → A7=不支持（</w:t>
+        <w:t>」处理（首建档须加 unique 冲突重试）。</w:t>
+      </w:r>
+    </w:p>
+    <w:p>
+      <w:r/>
+      <w:r>
+        <w:rPr>
+          <w:rFonts w:ascii="Microsoft YaHei" w:hAnsi="Microsoft YaHei" w:eastAsia="Microsoft YaHei"/>
+          <w:sz w:val="20"/>
+        </w:rPr>
+        <w:t xml:space="preserve">注：本 Runbook 顶部已定案 </w:t>
       </w:r>
       <w:r>
         <w:rPr>
@@ -1384,32 +2756,7 @@
           <w:rFonts w:ascii="Microsoft YaHei" w:hAnsi="Microsoft YaHei" w:eastAsia="Microsoft YaHei"/>
           <w:sz w:val="20"/>
         </w:rPr>
-        <w:t xml:space="preserve"> 不可用）→ 索引须控制台手工建，且 A6 </w:t>
-      </w:r>
-      <w:r>
-        <w:rPr>
-          <w:rFonts w:ascii="Microsoft YaHei" w:hAnsi="Microsoft YaHei" w:eastAsia="Microsoft YaHei"/>
-          <w:b/>
-          <w:sz w:val="20"/>
-        </w:rPr>
-        <w:t>升级</w:t>
-      </w:r>
-      <w:r>
-        <w:rPr>
-          <w:rFonts w:ascii="Microsoft YaHei" w:hAnsi="Microsoft YaHei" w:eastAsia="Microsoft YaHei"/>
-          <w:sz w:val="20"/>
-        </w:rPr>
-        <w:t>为</w:t>
-      </w:r>
-    </w:p>
-    <w:p>
-      <w:r/>
-      <w:r>
-        <w:rPr>
-          <w:rFonts w:ascii="Microsoft YaHei" w:hAnsi="Microsoft YaHei" w:eastAsia="Microsoft YaHei"/>
-          <w:sz w:val="20"/>
-        </w:rPr>
-        <w:t>「可能产生重复账号」（须给首建档加 unique 冲突重试）。</w:t>
+        <w:t xml:space="preserve"> 不可用，故此处「全在 → A7=支持」的旧分支不再适用。</w:t>
       </w:r>
     </w:p>
     <w:p>
@@ -1791,7 +3138,7 @@
           <w:color w:val="B03020"/>
           <w:sz w:val="19"/>
         </w:rPr>
-        <w:t>cloud1-4dgphoxy337f2a25</w:t>
+        <w:t>cloud1-d4gphpoxy337f2a25</w:t>
       </w:r>
       <w:r>
         <w:rPr>
@@ -2127,7 +3474,7 @@
           <w:rFonts w:ascii="Microsoft YaHei" w:hAnsi="Microsoft YaHei" w:eastAsia="Microsoft YaHei"/>
           <w:sz w:val="21"/>
         </w:rPr>
-        <w:t>索引清单：门禁 A7 关注 9 个 unique 索引；initDb 是否建索引由代码决定，本探针第②条专门验 createIndex 能力。</w:t>
+        <w:t>索引清单：门禁 A7 关注 10 个 unique 索引；initDb 是否建索引由代码决定，本探针第②条专门验 createIndex 能力。</w:t>
       </w:r>
     </w:p>
     <w:p>
@@ -2145,7 +3492,23 @@
           <w:b/>
           <w:sz w:val="23"/>
         </w:rPr>
-        <w:t>步骤 3 · 部署 smokeTest（含 common 副本）</w:t>
+        <w:t xml:space="preserve">步骤 3 · 部署 smokeTest（含 common </w:t>
+      </w:r>
+      <w:r>
+        <w:rPr>
+          <w:rFonts w:ascii="Microsoft YaHei" w:hAnsi="Microsoft YaHei" w:eastAsia="Microsoft YaHei"/>
+          <w:b/>
+          <w:sz w:val="23"/>
+        </w:rPr>
+        <w:t>扁平</w:t>
+      </w:r>
+      <w:r>
+        <w:rPr>
+          <w:rFonts w:ascii="Microsoft YaHei" w:hAnsi="Microsoft YaHei" w:eastAsia="Microsoft YaHei"/>
+          <w:b/>
+          <w:sz w:val="23"/>
+        </w:rPr>
+        <w:t>副本）</w:t>
       </w:r>
     </w:p>
     <w:p>
@@ -2158,22 +3521,83 @@
           <w:rFonts w:ascii="Microsoft YaHei" w:hAnsi="Microsoft YaHei" w:eastAsia="Microsoft YaHei"/>
           <w:sz w:val="21"/>
         </w:rPr>
-        <w:t xml:space="preserve">右键 </w:t>
-      </w:r>
+        <w:t>推荐命令行部署（服务端口已开）：</w:t>
+      </w:r>
+    </w:p>
+    <w:p>
+      <w:r/>
+      <w:r>
+        <w:rPr>
+          <w:rFonts w:ascii="Microsoft YaHei" w:hAnsi="Microsoft YaHei" w:eastAsia="Microsoft YaHei"/>
+          <w:sz w:val="20"/>
+        </w:rPr>
+        <w:t>```bat</w:t>
+      </w:r>
+    </w:p>
+    <w:p>
+      <w:r/>
+      <w:r>
+        <w:rPr>
+          <w:rFonts w:ascii="Microsoft YaHei" w:hAnsi="Microsoft YaHei" w:eastAsia="Microsoft YaHei"/>
+          <w:sz w:val="20"/>
+        </w:rPr>
+        <w:t>"C:\Program Files (x86)\Tencent\微信web开发者工具\cli.bat" cloud functions deploy ^</w:t>
+      </w:r>
+    </w:p>
+    <w:p>
+      <w:r/>
+      <w:r>
+        <w:rPr>
+          <w:rFonts w:ascii="Microsoft YaHei" w:hAnsi="Microsoft YaHei" w:eastAsia="Microsoft YaHei"/>
+          <w:sz w:val="20"/>
+        </w:rPr>
+        <w:t>--env cloud1-d4gphpoxy337f2a25 --names smokeTest ^</w:t>
+      </w:r>
+    </w:p>
+    <w:p>
+      <w:r/>
+      <w:r>
+        <w:rPr>
+          <w:rFonts w:ascii="Microsoft YaHei" w:hAnsi="Microsoft YaHei" w:eastAsia="Microsoft YaHei"/>
+          <w:sz w:val="20"/>
+        </w:rPr>
+        <w:t>--project "C:\Users\lzj\WorkBuddy\Claw\catering-profit" --remote-npm-install</w:t>
+      </w:r>
+    </w:p>
+    <w:p>
+      <w:r/>
       <w:r>
         <w:rPr>
           <w:rFonts w:ascii="Consolas" w:hAnsi="Consolas" w:eastAsia="Consolas"/>
           <w:color w:val="B03020"/>
+          <w:sz w:val="19"/>
+        </w:rPr>
+        <w:t>`</w:t>
+      </w:r>
+    </w:p>
+    <w:p>
+      <w:r/>
+      <w:r>
+        <w:rPr>
+          <w:rFonts w:ascii="Microsoft YaHei" w:hAnsi="Microsoft YaHei" w:eastAsia="Microsoft YaHei"/>
           <w:sz w:val="20"/>
         </w:rPr>
+        <w:t xml:space="preserve">或右键 </w:t>
+      </w:r>
+      <w:r>
+        <w:rPr>
+          <w:rFonts w:ascii="Consolas" w:hAnsi="Consolas" w:eastAsia="Consolas"/>
+          <w:color w:val="B03020"/>
+          <w:sz w:val="19"/>
+        </w:rPr>
         <w:t>cloudfunctions/smokeTest</w:t>
       </w:r>
       <w:r>
         <w:rPr>
           <w:rFonts w:ascii="Microsoft YaHei" w:hAnsi="Microsoft YaHei" w:eastAsia="Microsoft YaHei"/>
-          <w:sz w:val="21"/>
-        </w:rPr>
-        <w:t xml:space="preserve"> →「上传并部署：云端安装依赖」（wx-server-sdk 会云端 npm 安装）。</w:t>
+          <w:sz w:val="20"/>
+        </w:rPr>
+        <w:t xml:space="preserve"> →「上传并部署：云端安装依赖」。</w:t>
       </w:r>
     </w:p>
     <w:p>
@@ -2186,7 +3610,22 @@
           <w:rFonts w:ascii="Microsoft YaHei" w:hAnsi="Microsoft YaHei" w:eastAsia="Microsoft YaHei"/>
           <w:sz w:val="21"/>
         </w:rPr>
-        <w:t xml:space="preserve">上传时把本地 </w:t>
+        <w:t xml:space="preserve">🔴 </w:t>
+      </w:r>
+      <w:r>
+        <w:rPr>
+          <w:rFonts w:ascii="Microsoft YaHei" w:hAnsi="Microsoft YaHei" w:eastAsia="Microsoft YaHei"/>
+          <w:b/>
+          <w:sz w:val="21"/>
+        </w:rPr>
+        <w:t>副本必须是扁平的</w:t>
+      </w:r>
+      <w:r>
+        <w:rPr>
+          <w:rFonts w:ascii="Microsoft YaHei" w:hAnsi="Microsoft YaHei" w:eastAsia="Microsoft YaHei"/>
+          <w:sz w:val="21"/>
+        </w:rPr>
+        <w:t>（</w:t>
       </w:r>
       <w:r>
         <w:rPr>
@@ -2194,14 +3633,114 @@
           <w:color w:val="B03020"/>
           <w:sz w:val="20"/>
         </w:rPr>
-        <w:t>smokeTest/common/</w:t>
+        <w:t>common.js</w:t>
       </w:r>
       <w:r>
         <w:rPr>
           <w:rFonts w:ascii="Microsoft YaHei" w:hAnsi="Microsoft YaHei" w:eastAsia="Microsoft YaHei"/>
           <w:sz w:val="21"/>
         </w:rPr>
-        <w:t xml:space="preserve"> 副本一并打进包（微信打包本函数目录自身内容，副本就在目录内 → 这正是机制成立的关键）。</w:t>
+        <w:t xml:space="preserve"> + </w:t>
+      </w:r>
+      <w:r>
+        <w:rPr>
+          <w:rFonts w:ascii="Consolas" w:hAnsi="Consolas" w:eastAsia="Consolas"/>
+          <w:color w:val="B03020"/>
+          <w:sz w:val="20"/>
+        </w:rPr>
+        <w:t>cx_*.js</w:t>
+      </w:r>
+      <w:r>
+        <w:rPr>
+          <w:rFonts w:ascii="Microsoft YaHei" w:hAnsi="Microsoft YaHei" w:eastAsia="Microsoft YaHei"/>
+          <w:sz w:val="21"/>
+        </w:rPr>
+        <w:t xml:space="preserve">），**不能是 </w:t>
+      </w:r>
+      <w:r>
+        <w:rPr>
+          <w:rFonts w:ascii="Consolas" w:hAnsi="Consolas" w:eastAsia="Consolas"/>
+          <w:color w:val="B03020"/>
+          <w:sz w:val="20"/>
+        </w:rPr>
+        <w:t>common/</w:t>
+      </w:r>
+      <w:r>
+        <w:rPr>
+          <w:rFonts w:ascii="Microsoft YaHei" w:hAnsi="Microsoft YaHei" w:eastAsia="Microsoft YaHei"/>
+          <w:sz w:val="21"/>
+        </w:rPr>
+        <w:t xml:space="preserve"> 子目录**——2026-09-15 云端实测：子目录会被 Windows 打包拼成 </w:t>
+      </w:r>
+      <w:r>
+        <w:rPr>
+          <w:rFonts w:ascii="Consolas" w:hAnsi="Consolas" w:eastAsia="Consolas"/>
+          <w:color w:val="B03020"/>
+          <w:sz w:val="20"/>
+        </w:rPr>
+        <w:t>common\xxx.js</w:t>
+      </w:r>
+      <w:r>
+        <w:rPr>
+          <w:rFonts w:ascii="Microsoft YaHei" w:hAnsi="Microsoft YaHei" w:eastAsia="Microsoft YaHei"/>
+          <w:sz w:val="21"/>
+        </w:rPr>
+        <w:t xml:space="preserve"> 这种带反斜杠的扁平文件名，Linux 云端不认它是目录 → </w:t>
+      </w:r>
+      <w:r>
+        <w:rPr>
+          <w:rFonts w:ascii="Consolas" w:hAnsi="Consolas" w:eastAsia="Consolas"/>
+          <w:color w:val="B03020"/>
+          <w:sz w:val="20"/>
+        </w:rPr>
+        <w:t>MODULE_NOT_FOUND</w:t>
+      </w:r>
+      <w:r>
+        <w:rPr>
+          <w:rFonts w:ascii="Microsoft YaHei" w:hAnsi="Microsoft YaHei" w:eastAsia="Microsoft YaHei"/>
+          <w:sz w:val="21"/>
+        </w:rPr>
+        <w:t>。</w:t>
+      </w:r>
+    </w:p>
+    <w:p>
+      <w:r/>
+      <w:r>
+        <w:rPr>
+          <w:rFonts w:ascii="Microsoft YaHei" w:hAnsi="Microsoft YaHei" w:eastAsia="Microsoft YaHei"/>
+          <w:sz w:val="20"/>
+        </w:rPr>
+        <w:t xml:space="preserve">⇒ 上传前跑 </w:t>
+      </w:r>
+      <w:r>
+        <w:rPr>
+          <w:rFonts w:ascii="Consolas" w:hAnsi="Consolas" w:eastAsia="Consolas"/>
+          <w:color w:val="B03020"/>
+          <w:sz w:val="19"/>
+        </w:rPr>
+        <w:t>node tools/sync_common.js</w:t>
+      </w:r>
+      <w:r>
+        <w:rPr>
+          <w:rFonts w:ascii="Microsoft YaHei" w:hAnsi="Microsoft YaHei" w:eastAsia="Microsoft YaHei"/>
+          <w:sz w:val="20"/>
+        </w:rPr>
+        <w:t xml:space="preserve">（它已改为扁平派生）；若用旧版脚本生成了 </w:t>
+      </w:r>
+      <w:r>
+        <w:rPr>
+          <w:rFonts w:ascii="Consolas" w:hAnsi="Consolas" w:eastAsia="Consolas"/>
+          <w:color w:val="B03020"/>
+          <w:sz w:val="19"/>
+        </w:rPr>
+        <w:t>common/</w:t>
+      </w:r>
+      <w:r>
+        <w:rPr>
+          <w:rFonts w:ascii="Microsoft YaHei" w:hAnsi="Microsoft YaHei" w:eastAsia="Microsoft YaHei"/>
+          <w:sz w:val="20"/>
+        </w:rPr>
+        <w:t xml:space="preserve"> 子目录，须先删掉再同步。</w:t>
       </w:r>
     </w:p>
     <w:p>
@@ -2446,7 +3985,7 @@
                 <w:color w:val="B03020"/>
                 <w:sz w:val="18"/>
               </w:rPr>
-              <w:t>cloud1-4dgphoxy337f2a25</w:t>
+              <w:t>cloud1-d4gphpoxy337f2a25</w:t>
             </w:r>
             <w:r>
               <w:rPr>
@@ -3257,7 +4796,22 @@
           <w:rFonts w:ascii="Microsoft YaHei" w:hAnsi="Microsoft YaHei" w:eastAsia="Microsoft YaHei"/>
           <w:sz w:val="21"/>
         </w:rPr>
-        <w:t>，把第 14–15 行的占位符换成步骤 1 记下的真实环境 ID。</w:t>
+        <w:t xml:space="preserve">，把 </w:t>
+      </w:r>
+      <w:r>
+        <w:rPr>
+          <w:rFonts w:ascii="Microsoft YaHei" w:hAnsi="Microsoft YaHei" w:eastAsia="Microsoft YaHei"/>
+          <w:b/>
+          <w:sz w:val="21"/>
+        </w:rPr>
+        <w:t>prod 槽（第 17 行）</w:t>
+      </w:r>
+      <w:r>
+        <w:rPr>
+          <w:rFonts w:ascii="Microsoft YaHei" w:hAnsi="Microsoft YaHei" w:eastAsia="Microsoft YaHei"/>
+          <w:sz w:val="21"/>
+        </w:rPr>
+        <w:t>的占位符换成步骤 1 记下的真实环境 ID（dev 槽已在第 16 行填好）。</w:t>
       </w:r>
     </w:p>
     <w:p>
@@ -3301,7 +4855,7 @@
           <w:color w:val="B03020"/>
           <w:sz w:val="20"/>
         </w:rPr>
-        <w:t>cloud1-4dgphoxy337f2a25</w:t>
+        <w:t>cloud1-d4gphpoxy337f2a25</w:t>
       </w:r>
       <w:r>
         <w:rPr>
@@ -3321,7 +4875,22 @@
           <w:rFonts w:ascii="Microsoft YaHei" w:hAnsi="Microsoft YaHei" w:eastAsia="Microsoft YaHei"/>
           <w:sz w:val="21"/>
         </w:rPr>
-        <w:t>这是判据④唯一未完项；prod 环境建好并替换后，batch0 自测的「点4 未完成」会变 ✅。</w:t>
+        <w:t>判据④ 现</w:t>
+      </w:r>
+      <w:r>
+        <w:rPr>
+          <w:rFonts w:ascii="Microsoft YaHei" w:hAnsi="Microsoft YaHei" w:eastAsia="Microsoft YaHei"/>
+          <w:b/>
+          <w:sz w:val="21"/>
+        </w:rPr>
+        <w:t>仅剩 prod 这一项</w:t>
+      </w:r>
+      <w:r>
+        <w:rPr>
+          <w:rFonts w:ascii="Microsoft YaHei" w:hAnsi="Microsoft YaHei" w:eastAsia="Microsoft YaHei"/>
+          <w:sz w:val="21"/>
+        </w:rPr>
+        <w:t>（dev 侧已闭环）；prod 环境建好并替换后，batch0 自测的「点4 未完成」会变 ✅。</w:t>
       </w:r>
     </w:p>
     <w:p>
@@ -3459,7 +5028,7 @@
           <w:rFonts w:ascii="Microsoft YaHei" w:hAnsi="Microsoft YaHei" w:eastAsia="Microsoft YaHei"/>
           <w:sz w:val="21"/>
         </w:rPr>
-        <w:t>（8 套件）/ 读 POC3 引擎确认整数分落库+口径锁 directCost+待结算不进利润 / 变异 bizRefProfitFen+1 看 test_poc3 15 条转红。</w:t>
+        <w:t>（9 套件）/ 读 POC3 引擎确认整数分落库+口径锁 directCost+待结算不进利润 / 变异 bizRefProfitFen+1 看 test_poc3 15 条转红。</w:t>
       </w:r>
     </w:p>
     <w:p>
@@ -3498,7 +5067,7 @@
           <w:color w:val="B03020"/>
           <w:sz w:val="20"/>
         </w:rPr>
-        <w:t>__probe</w:t>
+        <w:t>probe_tmp</w:t>
       </w:r>
       <w:r>
         <w:rPr>
@@ -3725,14 +5294,14 @@
           <w:color w:val="B03020"/>
           <w:sz w:val="20"/>
         </w:rPr>
-        <w:t>./</w:t>
+        <w:t>../</w:t>
       </w:r>
       <w:r>
         <w:rPr>
           <w:rFonts w:ascii="Microsoft YaHei" w:hAnsi="Microsoft YaHei" w:eastAsia="Microsoft YaHei"/>
           <w:sz w:val="21"/>
         </w:rPr>
-        <w:t xml:space="preserve"> 指本函数目录内的副本（云端能找到）；</w:t>
+        <w:t xml:space="preserve"> 指兄弟目录 </w:t>
       </w:r>
       <w:r>
         <w:rPr>
@@ -3740,14 +5309,14 @@
           <w:color w:val="B03020"/>
           <w:sz w:val="20"/>
         </w:rPr>
-        <w:t>../</w:t>
+        <w:t>cloudfunctions/common/</w:t>
       </w:r>
       <w:r>
         <w:rPr>
           <w:rFonts w:ascii="Microsoft YaHei" w:hAnsi="Microsoft YaHei" w:eastAsia="Microsoft YaHei"/>
           <w:sz w:val="21"/>
         </w:rPr>
-        <w:t xml:space="preserve"> 指兄弟目录 </w:t>
+        <w:t>（云端打包不含兄弟目录 → MODULE_NOT_FOUND）；</w:t>
       </w:r>
       <w:r>
         <w:rPr>
@@ -3755,14 +5324,169 @@
           <w:color w:val="B03020"/>
           <w:sz w:val="20"/>
         </w:rPr>
-        <w:t>cloudfunctions/common/</w:t>
+        <w:t>./</w:t>
       </w:r>
       <w:r>
         <w:rPr>
           <w:rFonts w:ascii="Microsoft YaHei" w:hAnsi="Microsoft YaHei" w:eastAsia="Microsoft YaHei"/>
           <w:sz w:val="21"/>
         </w:rPr>
-        <w:t>（云端打包不含兄弟目录 → MODULE_NOT_FOUND）。这正是本机制的命门。</w:t>
+        <w:t xml:space="preserve"> 指本函数目录内的副本。</w:t>
+      </w:r>
+    </w:p>
+    <w:p>
+      <w:r/>
+      <w:r>
+        <w:rPr>
+          <w:rFonts w:ascii="Microsoft YaHei" w:hAnsi="Microsoft YaHei" w:eastAsia="Microsoft YaHei"/>
+          <w:sz w:val="20"/>
+        </w:rPr>
+        <w:t xml:space="preserve">🔴 </w:t>
+      </w:r>
+      <w:r>
+        <w:rPr>
+          <w:rFonts w:ascii="Microsoft YaHei" w:hAnsi="Microsoft YaHei" w:eastAsia="Microsoft YaHei"/>
+          <w:b/>
+          <w:sz w:val="20"/>
+        </w:rPr>
+        <w:t>2026-09-15 云端实测补一条铁律</w:t>
+      </w:r>
+      <w:r>
+        <w:rPr>
+          <w:rFonts w:ascii="Microsoft YaHei" w:hAnsi="Microsoft YaHei" w:eastAsia="Microsoft YaHei"/>
+          <w:sz w:val="20"/>
+        </w:rPr>
+        <w:t>：即便是</w:t>
+      </w:r>
+      <w:r>
+        <w:rPr>
+          <w:rFonts w:ascii="Microsoft YaHei" w:hAnsi="Microsoft YaHei" w:eastAsia="Microsoft YaHei"/>
+          <w:b/>
+          <w:sz w:val="20"/>
+        </w:rPr>
+        <w:t>本函数目录内的子目录</w:t>
+      </w:r>
+      <w:r>
+        <w:rPr>
+          <w:rFonts w:ascii="Microsoft YaHei" w:hAnsi="Microsoft YaHei" w:eastAsia="Microsoft YaHei"/>
+          <w:sz w:val="20"/>
+        </w:rPr>
+        <w:t>（</w:t>
+      </w:r>
+      <w:r>
+        <w:rPr>
+          <w:rFonts w:ascii="Consolas" w:hAnsi="Consolas" w:eastAsia="Consolas"/>
+          <w:color w:val="B03020"/>
+          <w:sz w:val="19"/>
+        </w:rPr>
+        <w:t>&lt;func&gt;/common/</w:t>
+      </w:r>
+      <w:r>
+        <w:rPr>
+          <w:rFonts w:ascii="Microsoft YaHei" w:hAnsi="Microsoft YaHei" w:eastAsia="Microsoft YaHei"/>
+          <w:sz w:val="20"/>
+        </w:rPr>
+        <w:t>），真云端</w:t>
+      </w:r>
+      <w:r>
+        <w:rPr>
+          <w:rFonts w:ascii="Microsoft YaHei" w:hAnsi="Microsoft YaHei" w:eastAsia="Microsoft YaHei"/>
+          <w:b/>
+          <w:sz w:val="20"/>
+        </w:rPr>
+        <w:t>依然 MODULE_NOT_FOUND</w:t>
+      </w:r>
+      <w:r>
+        <w:rPr>
+          <w:rFonts w:ascii="Microsoft YaHei" w:hAnsi="Microsoft YaHei" w:eastAsia="Microsoft YaHei"/>
+          <w:sz w:val="20"/>
+        </w:rPr>
+        <w:t xml:space="preserve"> —— Windows 打包把它拼成 </w:t>
+      </w:r>
+      <w:r>
+        <w:rPr>
+          <w:rFonts w:ascii="Consolas" w:hAnsi="Consolas" w:eastAsia="Consolas"/>
+          <w:color w:val="B03020"/>
+          <w:sz w:val="19"/>
+        </w:rPr>
+        <w:t>common\xxx.js</w:t>
+      </w:r>
+      <w:r>
+        <w:rPr>
+          <w:rFonts w:ascii="Microsoft YaHei" w:hAnsi="Microsoft YaHei" w:eastAsia="Microsoft YaHei"/>
+          <w:sz w:val="20"/>
+        </w:rPr>
+        <w:t>（文件名含反斜杠），Linux 云端不认它是目录（</w:t>
+      </w:r>
+      <w:r>
+        <w:rPr>
+          <w:rFonts w:ascii="Consolas" w:hAnsi="Consolas" w:eastAsia="Consolas"/>
+          <w:color w:val="B03020"/>
+          <w:sz w:val="19"/>
+        </w:rPr>
+        <w:t>fsDiag.hasCommonDir=false</w:t>
+      </w:r>
+      <w:r>
+        <w:rPr>
+          <w:rFonts w:ascii="Microsoft YaHei" w:hAnsi="Microsoft YaHei" w:eastAsia="Microsoft YaHei"/>
+          <w:sz w:val="20"/>
+        </w:rPr>
+        <w:t>）。</w:t>
+      </w:r>
+    </w:p>
+    <w:p>
+      <w:r/>
+      <w:r>
+        <w:rPr>
+          <w:rFonts w:ascii="Microsoft YaHei" w:hAnsi="Microsoft YaHei" w:eastAsia="Microsoft YaHei"/>
+          <w:sz w:val="20"/>
+        </w:rPr>
+        <w:t xml:space="preserve">⇒ </w:t>
+      </w:r>
+      <w:r>
+        <w:rPr>
+          <w:rFonts w:ascii="Microsoft YaHei" w:hAnsi="Microsoft YaHei" w:eastAsia="Microsoft YaHei"/>
+          <w:b/>
+          <w:sz w:val="20"/>
+        </w:rPr>
+        <w:t>云函数包内禁用子目录</w:t>
+      </w:r>
+      <w:r>
+        <w:rPr>
+          <w:rFonts w:ascii="Microsoft YaHei" w:hAnsi="Microsoft YaHei" w:eastAsia="Microsoft YaHei"/>
+          <w:sz w:val="20"/>
+        </w:rPr>
+        <w:t xml:space="preserve">：副本一律扁平为 </w:t>
+      </w:r>
+      <w:r>
+        <w:rPr>
+          <w:rFonts w:ascii="Consolas" w:hAnsi="Consolas" w:eastAsia="Consolas"/>
+          <w:color w:val="B03020"/>
+          <w:sz w:val="19"/>
+        </w:rPr>
+        <w:t>&lt;func&gt;/common.js</w:t>
+      </w:r>
+      <w:r>
+        <w:rPr>
+          <w:rFonts w:ascii="Microsoft YaHei" w:hAnsi="Microsoft YaHei" w:eastAsia="Microsoft YaHei"/>
+          <w:sz w:val="20"/>
+        </w:rPr>
+        <w:t xml:space="preserve">（入口）+ </w:t>
+      </w:r>
+      <w:r>
+        <w:rPr>
+          <w:rFonts w:ascii="Consolas" w:hAnsi="Consolas" w:eastAsia="Consolas"/>
+          <w:color w:val="B03020"/>
+          <w:sz w:val="19"/>
+        </w:rPr>
+        <w:t>&lt;func&gt;/cx_*.js</w:t>
+      </w:r>
+      <w:r>
+        <w:rPr>
+          <w:rFonts w:ascii="Microsoft YaHei" w:hAnsi="Microsoft YaHei" w:eastAsia="Microsoft YaHei"/>
+          <w:sz w:val="20"/>
+        </w:rPr>
+        <w:t>（模块）。这是本机制真正的命门。</w:t>
       </w:r>
     </w:p>
     <w:p>
@@ -5170,7 +6894,7 @@
           <w:rFonts w:ascii="Microsoft YaHei" w:hAnsi="Microsoft YaHei" w:eastAsia="Microsoft YaHei"/>
           <w:sz w:val="21"/>
         </w:rPr>
-        <w:t xml:space="preserve">（8 套件）→ ④ 复审方核判据 + 独立变异 → ⑤ </w:t>
+        <w:t xml:space="preserve">（9 套件）→ ④ 复审方核判据 + 独立变异 → ⑤ </w:t>
       </w:r>
       <w:r>
         <w:rPr>
@@ -5362,7 +7086,7 @@
           <w:b/>
           <w:sz w:val="21"/>
         </w:rPr>
-        <w:t>生成 → 门禁(8 套件) → 复审 → 过了才部署 dev/prod</w:t>
+        <w:t>生成 → 门禁(9 套件) → 复审 → 过了才部署 dev/prod</w:t>
       </w:r>
       <w:r>
         <w:rPr>

</xml_diff>